<commit_message>
Update Assignment 1 report: simpler wording, fixes, LaTeX version
Rewrite the report text in simpler English, correct a few numbers
(baseline repetition share, sigma ratio range, top-200 energy range),
add the format-vs-reasoning breakdown for Q1/Q3, and add a LaTeX copy
of the report for Overleaf.

Co-Authored-By: Claude Opus 5.5 <noreply@anthropic.com>
</commit_message>
<xml_diff>
--- a/Assignment1/report/Asg1_413551034.docx
+++ b/Assignment1/report/Asg1_413551034.docx
@@ -57,11 +57,12 @@
           <w:i/>
           <w:sz w:val="18"/>
         </w:rPr>
-        <w:t>Setup: Llama-3.2-1B fine-tuned with PiSSA on 25,000 MetaMathQA samples (1 epoch, lr 2e-5, global batch 128, FP16, all 7 projection types), evaluated on 1,000 GSM8K and 1,000 MATH test problems. All runs were done on a single local RTX 3090 (24 GB) with micro-batch 4 × 32 accumulation steps; SVD initialization ran on the CPU.</w:t>
+        <w:t>Setup: I fine-tuned Llama-3.2-1B with PiSSA on 25,000 MetaMathQA samples (1 epoch, learning rate 2e-5, batch size 128, FP16, all 7 projection layers). I tested on 1,000 GSM8K and 1,000 MATH questions. All runs used one RTX 3090 (24 GB) on my own computer, with micro-batch 4 and 32 accumulation steps. The SVD step ran on the CPU.</w:t>
       </w:r>
     </w:p>
     <w:p>
       <w:pPr>
+        <w:keepNext/>
         <w:spacing w:before="120" w:after="40"/>
         <w:pBdr>
           <w:bottom w:val="single" w:sz="4" w:space="1" w:color="1F3A68"/>
@@ -393,10 +394,10 @@
         <w:rPr>
           <w:b/>
         </w:rPr>
-        <w:t xml:space="preserve">Baseline. </w:t>
+        <w:t xml:space="preserve">Original model. </w:t>
       </w:r>
       <w:r>
-        <w:t>The original model scores only 3.4% on GSM8K and 0.1% on MATH. It is a base (non-instruction) model, so it rarely produces a final answer in a parseable form: it never writes "The answer is:", and 959 of the 1,000 MATH outputs contain no extractable answer at all. Fine-tuning on MetaMathQA teaches both step-by-step reasoning and the answer format, so even rank 16 jumps to 15.6% / 3.7%.</w:t>
+        <w:t>The original model is very weak: 3.4% on GSM8K and 0.1% on MATH. It is a base model, not a chat model, so it does not really solve the question. In about half of the answers, it just repeats the same sentence again and again. Only 37 GSM8K answers and 41 MATH answers give a clear final answer (like "The answer is:", "####" or \boxed{}). For MATH, 959 answers have no answer that the parser can find. After fine-tuning on MetaMathQA, the model learns to solve step by step and to write the answer in the right format. So even rank 16 goes up to 15.6% / 3.7%.</w:t>
       </w:r>
     </w:p>
     <w:p>
@@ -411,7 +412,7 @@
         <w:t xml:space="preserve">Effect of rank. </w:t>
       </w:r>
       <w:r>
-        <w:t>Accuracy rises monotonically with rank: GSM8K 15.6% → 20.7% → 27.3%, MATH 3.7% → 4.8% → 5.4%. A larger rank gives more trainable parameters (0.9% → 3.6% → 14.6% of the model) and, with PiSSA, the adapter starts from a larger share of each weight's principal components, so the same learning rate and one epoch move a bigger, more important subspace. The final training loss drops accordingly (0.455 → 0.414 → 0.375).</w:t>
+        <w:t>When the rank is bigger, the accuracy is higher on both datasets: GSM8K 15.6% → 20.7% → 27.3%, and MATH 3.7% → 4.8% → 5.4%. A bigger rank means more trainable parameters (0.9% → 3.6% → 14.6% of the model). Also, in PiSSA, a bigger rank means the adapter starts from more of the main (principal) parts of the weight. So with the same learning rate and one epoch, the model can change more. The final training loss also goes down (0.455 → 0.414 → 0.375).</w:t>
       </w:r>
     </w:p>
     <w:p>
@@ -423,14 +424,338 @@
         <w:rPr>
           <w:b/>
         </w:rPr>
-        <w:t xml:space="preserve">Dataset difference. </w:t>
+        <w:t xml:space="preserve">Format or reasoning? </w:t>
       </w:r>
       <w:r>
-        <w:t>GSM8K gains far more (+11.7 points from rank 16 to 256) than MATH (+1.7). GSM8K problems are short arithmetic word problems that closely match the MetaMathQA augmentations, and its gains have not saturated at rank 256. MATH needs competition-level knowledge and LaTeX-style answers (fractions, radicals, intervals) that a 1B model cannot acquire from 25k examples in one epoch; about 45% of MATH outputs still contain no parseable answer, so its curve flattens much sooner.</w:t>
+        <w:t>I also checked if the model only learns the answer format. The table below shows how many answers have a clear final answer, and the accuracy of these answers. On GSM8K, the number is almost the same after rank 16 (951, 957, 954), so the format is already learned. But the accuracy still goes up (16.4% → 21.6% → 28.6%). This means a bigger rank really helps the reasoning, not only the format. On MATH, both become better: more clear answers (452 → 547) and higher accuracy (8.2% → 9.9%). However, the reasoning is still not good. Many answers have a nice format but wrong calculation.</w:t>
+      </w:r>
+    </w:p>
+    <w:tbl>
+      <w:tblPr>
+        <w:tblStyle w:val="TableGrid"/>
+        <w:tblW w:type="auto" w:w="0"/>
+        <w:jc w:val="center"/>
+        <w:tblLook w:firstColumn="1" w:firstRow="1" w:lastColumn="0" w:lastRow="0" w:noHBand="0" w:noVBand="1" w:val="04A0"/>
+      </w:tblPr>
+      <w:tblGrid>
+        <w:gridCol w:w="1973"/>
+        <w:gridCol w:w="1973"/>
+        <w:gridCol w:w="1973"/>
+        <w:gridCol w:w="1973"/>
+        <w:gridCol w:w="1973"/>
+      </w:tblGrid>
+      <w:tr>
+        <w:tc>
+          <w:tcPr>
+            <w:tcW w:type="dxa" w:w="2381"/>
+            <w:shd w:val="clear" w:color="auto" w:fill="DCE6F2"/>
+          </w:tcPr>
+          <w:p>
+            <w:pPr>
+              <w:spacing w:after="0"/>
+              <w:jc w:val="center"/>
+            </w:pPr>
+            <w:r/>
+            <w:r>
+              <w:rPr>
+                <w:b/>
+                <w:sz w:val="18"/>
+              </w:rPr>
+              <w:t>Clear final answers (accuracy of them)</w:t>
+            </w:r>
+          </w:p>
+        </w:tc>
+        <w:tc>
+          <w:tcPr>
+            <w:tcW w:type="dxa" w:w="1644"/>
+            <w:shd w:val="clear" w:color="auto" w:fill="DCE6F2"/>
+          </w:tcPr>
+          <w:p>
+            <w:pPr>
+              <w:spacing w:after="0"/>
+              <w:jc w:val="center"/>
+            </w:pPr>
+            <w:r/>
+            <w:r>
+              <w:rPr>
+                <w:b/>
+                <w:sz w:val="18"/>
+              </w:rPr>
+              <w:t>Original LLM</w:t>
+            </w:r>
+          </w:p>
+        </w:tc>
+        <w:tc>
+          <w:tcPr>
+            <w:tcW w:type="dxa" w:w="1871"/>
+            <w:shd w:val="clear" w:color="auto" w:fill="DCE6F2"/>
+          </w:tcPr>
+          <w:p>
+            <w:pPr>
+              <w:spacing w:after="0"/>
+              <w:jc w:val="center"/>
+            </w:pPr>
+            <w:r/>
+            <w:r>
+              <w:rPr>
+                <w:b/>
+                <w:sz w:val="18"/>
+              </w:rPr>
+              <w:t>Fine-Tuned (RANK = 16)</w:t>
+            </w:r>
+          </w:p>
+        </w:tc>
+        <w:tc>
+          <w:tcPr>
+            <w:tcW w:type="dxa" w:w="1871"/>
+            <w:shd w:val="clear" w:color="auto" w:fill="DCE6F2"/>
+          </w:tcPr>
+          <w:p>
+            <w:pPr>
+              <w:spacing w:after="0"/>
+              <w:jc w:val="center"/>
+            </w:pPr>
+            <w:r/>
+            <w:r>
+              <w:rPr>
+                <w:b/>
+                <w:sz w:val="18"/>
+              </w:rPr>
+              <w:t>Fine-Tuned (RANK = 64)</w:t>
+            </w:r>
+          </w:p>
+        </w:tc>
+        <w:tc>
+          <w:tcPr>
+            <w:tcW w:type="dxa" w:w="1928"/>
+            <w:shd w:val="clear" w:color="auto" w:fill="DCE6F2"/>
+          </w:tcPr>
+          <w:p>
+            <w:pPr>
+              <w:spacing w:after="0"/>
+              <w:jc w:val="center"/>
+            </w:pPr>
+            <w:r/>
+            <w:r>
+              <w:rPr>
+                <w:b/>
+                <w:sz w:val="18"/>
+              </w:rPr>
+              <w:t>Fine-Tuned (RANK = 256)</w:t>
+            </w:r>
+          </w:p>
+        </w:tc>
+      </w:tr>
+      <w:tr>
+        <w:tc>
+          <w:tcPr>
+            <w:tcW w:type="dxa" w:w="2381"/>
+          </w:tcPr>
+          <w:p>
+            <w:pPr>
+              <w:spacing w:after="0"/>
+              <w:jc w:val="center"/>
+            </w:pPr>
+            <w:r/>
+            <w:r>
+              <w:rPr>
+                <w:b/>
+                <w:sz w:val="18"/>
+              </w:rPr>
+              <w:t>GSM8K</w:t>
+            </w:r>
+          </w:p>
+        </w:tc>
+        <w:tc>
+          <w:tcPr>
+            <w:tcW w:type="dxa" w:w="1644"/>
+          </w:tcPr>
+          <w:p>
+            <w:pPr>
+              <w:spacing w:after="0"/>
+              <w:jc w:val="center"/>
+            </w:pPr>
+            <w:r/>
+            <w:r>
+              <w:rPr>
+                <w:sz w:val="18"/>
+              </w:rPr>
+              <w:t>37 (13.5%)</w:t>
+            </w:r>
+          </w:p>
+        </w:tc>
+        <w:tc>
+          <w:tcPr>
+            <w:tcW w:type="dxa" w:w="1871"/>
+          </w:tcPr>
+          <w:p>
+            <w:pPr>
+              <w:spacing w:after="0"/>
+              <w:jc w:val="center"/>
+            </w:pPr>
+            <w:r/>
+            <w:r>
+              <w:rPr>
+                <w:sz w:val="18"/>
+              </w:rPr>
+              <w:t>951 (16.4%)</w:t>
+            </w:r>
+          </w:p>
+        </w:tc>
+        <w:tc>
+          <w:tcPr>
+            <w:tcW w:type="dxa" w:w="1871"/>
+          </w:tcPr>
+          <w:p>
+            <w:pPr>
+              <w:spacing w:after="0"/>
+              <w:jc w:val="center"/>
+            </w:pPr>
+            <w:r/>
+            <w:r>
+              <w:rPr>
+                <w:sz w:val="18"/>
+              </w:rPr>
+              <w:t>957 (21.6%)</w:t>
+            </w:r>
+          </w:p>
+        </w:tc>
+        <w:tc>
+          <w:tcPr>
+            <w:tcW w:type="dxa" w:w="1928"/>
+          </w:tcPr>
+          <w:p>
+            <w:pPr>
+              <w:spacing w:after="0"/>
+              <w:jc w:val="center"/>
+            </w:pPr>
+            <w:r/>
+            <w:r>
+              <w:rPr>
+                <w:sz w:val="18"/>
+              </w:rPr>
+              <w:t>954 (28.6%)</w:t>
+            </w:r>
+          </w:p>
+        </w:tc>
+      </w:tr>
+      <w:tr>
+        <w:tc>
+          <w:tcPr>
+            <w:tcW w:type="dxa" w:w="2381"/>
+          </w:tcPr>
+          <w:p>
+            <w:pPr>
+              <w:spacing w:after="0"/>
+              <w:jc w:val="center"/>
+            </w:pPr>
+            <w:r/>
+            <w:r>
+              <w:rPr>
+                <w:b/>
+                <w:sz w:val="18"/>
+              </w:rPr>
+              <w:t>MATH</w:t>
+            </w:r>
+          </w:p>
+        </w:tc>
+        <w:tc>
+          <w:tcPr>
+            <w:tcW w:type="dxa" w:w="1644"/>
+          </w:tcPr>
+          <w:p>
+            <w:pPr>
+              <w:spacing w:after="0"/>
+              <w:jc w:val="center"/>
+            </w:pPr>
+            <w:r/>
+            <w:r>
+              <w:rPr>
+                <w:sz w:val="18"/>
+              </w:rPr>
+              <w:t>41 (2.4%)</w:t>
+            </w:r>
+          </w:p>
+        </w:tc>
+        <w:tc>
+          <w:tcPr>
+            <w:tcW w:type="dxa" w:w="1871"/>
+          </w:tcPr>
+          <w:p>
+            <w:pPr>
+              <w:spacing w:after="0"/>
+              <w:jc w:val="center"/>
+            </w:pPr>
+            <w:r/>
+            <w:r>
+              <w:rPr>
+                <w:sz w:val="18"/>
+              </w:rPr>
+              <w:t>452 (8.2%)</w:t>
+            </w:r>
+          </w:p>
+        </w:tc>
+        <w:tc>
+          <w:tcPr>
+            <w:tcW w:type="dxa" w:w="1871"/>
+          </w:tcPr>
+          <w:p>
+            <w:pPr>
+              <w:spacing w:after="0"/>
+              <w:jc w:val="center"/>
+            </w:pPr>
+            <w:r/>
+            <w:r>
+              <w:rPr>
+                <w:sz w:val="18"/>
+              </w:rPr>
+              <w:t>523 (9.2%)</w:t>
+            </w:r>
+          </w:p>
+        </w:tc>
+        <w:tc>
+          <w:tcPr>
+            <w:tcW w:type="dxa" w:w="1928"/>
+          </w:tcPr>
+          <w:p>
+            <w:pPr>
+              <w:spacing w:after="0"/>
+              <w:jc w:val="center"/>
+            </w:pPr>
+            <w:r/>
+            <w:r>
+              <w:rPr>
+                <w:sz w:val="18"/>
+              </w:rPr>
+              <w:t>547 (9.9%)</w:t>
+            </w:r>
+          </w:p>
+        </w:tc>
+      </w:tr>
+    </w:tbl>
+    <w:p>
+      <w:pPr>
+        <w:spacing w:after="0"/>
+      </w:pPr>
+    </w:p>
+    <w:p>
+      <w:pPr>
+        <w:pStyle w:val="ListBullet"/>
+        <w:spacing w:after="20"/>
+      </w:pPr>
+      <w:r>
+        <w:rPr>
+          <w:b/>
+        </w:rPr>
+        <w:t xml:space="preserve">GSM8K vs. MATH. </w:t>
+      </w:r>
+      <w:r>
+        <w:t>GSM8K improves much more than MATH (+11.7 points vs. +1.7 points from rank 16 to 256). GSM8K questions are simple word problems, and they are similar to the MetaMathQA training data. Its accuracy is still going up at rank 256. MATH questions are much harder. They need more math knowledge and answers in LaTeX form (fractions, square roots, intervals). A 1B model cannot learn this from 25k samples in one epoch. About 45% of MATH answers still have no answer that the parser can find, so MATH improves only a little.</w:t>
       </w:r>
     </w:p>
     <w:p>
       <w:pPr>
+        <w:keepNext/>
         <w:spacing w:before="120" w:after="40"/>
         <w:pBdr>
           <w:bottom w:val="single" w:sz="4" w:space="1" w:color="1F3A68"/>
@@ -707,7 +1032,7 @@
         <w:t xml:space="preserve">Trend. </w:t>
       </w:r>
       <w:r>
-        <w:t>Going from rank 16 to 64 multiplies trainable parameters by 4× but adds only 2.7 minutes (+8%); going to rank 256 (16× parameters) takes 64.0 minutes (+78% over rank 16). Training time therefore grows with rank, but far slower than the parameter count.</w:t>
+        <w:t>From rank 16 to 64, the trainable parameters become 4 times more, but the training time only increases by 2.7 minutes (+8%). From rank 16 to 256, the parameters become 16 times more, and the time becomes 64.0 minutes (+78%). So the training time increases with the rank, but much slower than the number of parameters.</w:t>
       </w:r>
     </w:p>
     <w:p>
@@ -719,14 +1044,15 @@
         <w:rPr>
           <w:b/>
         </w:rPr>
-        <w:t xml:space="preserve">Explanation. </w:t>
+        <w:t xml:space="preserve">Reason. </w:t>
       </w:r>
       <w:r>
-        <w:t>Each step is dominated by the forward and backward pass through the frozen 1.2B-parameter residual weights and by attention/activation work, which do not depend on the rank. The adapter adds two thin matmuls costing r(d+k) per token versus dk for the base weight: for a 2048×2048 projection that is about 1.6% extra at r = 16 but 25% at r = 256 (and its weight gradients must also be computed, unlike the frozen base). Rank 256 also has 180M trainable parameters with FP32 AdamW states and gradients, adding optimizer-step time and memory traffic. So the cost is nearly flat at small ranks and becomes noticeable only when r is a sizeable fraction of the hidden size. The one-off SVD initialization (~100 s on the CPU) is excluded and is the same for every rank, since a full SVD is computed regardless of r.</w:t>
+        <w:t>Most of the training time is used to run the big frozen model (1.2B parameters) forward and backward. This part does not depend on the rank. The adapter only adds two small matrix multiplications. Their cost is r(d+k), while the original weight costs dk. For a 2048×2048 layer, this is only about 1.6% more at r = 16, but about 25% more at r = 256. The adapter also needs its own weight gradients. In addition, rank 256 has 180M trainable parameters, and AdamW keeps extra states for each of them, so the optimizer step is also slower. That is why the time is almost the same for small ranks, and only becomes clearly longer at rank 256. The SVD step at the beginning (about 100 seconds on the CPU) is not included. It takes the same time for all ranks, because the code always computes the full SVD.</w:t>
       </w:r>
     </w:p>
     <w:p>
       <w:pPr>
+        <w:keepNext/>
         <w:spacing w:before="120" w:after="40"/>
         <w:pBdr>
           <w:bottom w:val="single" w:sz="4" w:space="1" w:color="1F3A68"/>
@@ -1100,7 +1426,7 @@
         <w:t xml:space="preserve">Trend. </w:t>
       </w:r>
       <w:r>
-        <w:t>The top-16 (principal) range is clearly best on both datasets (15.6% GSM8K, 3.7% MATH). Moving the 16 directions down the spectrum lowers accuracy: 12.3% / 11.8% / 11.5% on GSM8K and 3.2% / 2.1% / 2.4% on MATH for the 25%, 50% and bottom ranges. The training loss shows the same order (average of the last 10 updates: 0.419 top, 0.462 25%, 0.467 50%, 0.476 bottom). The non-principal ranges differ from each other by at most ~1 point, which is within the sampling noise of a 1,000-question test set (standard error ≈ 1.0 point on GSM8K, ≈ 0.5 on MATH), so they are essentially tied; only the gap to the top range is clear.</w:t>
+        <w:t>The top 16 singular values give the best result on both datasets (15.6% on GSM8K, 3.7% on MATH). When we use smaller singular values, the accuracy becomes lower: 12.3% / 11.8% / 11.5% on GSM8K and 3.2% / 2.1% / 2.4% on MATH (from 25%, from 50%, bottom). The training loss has the same order (average of the last 10 steps: 0.419, 0.462, 0.467, 0.476). The three non-top ranges are very close, within about 1 point. With only 1,000 test questions, the random error is about 1 point on GSM8K and 0.5 point on MATH. So I think these three are about the same, and only the top 16 is clearly better. The top 16 is better in both format and reasoning: on GSM8K it gives more clear answers (951 vs. 859-904), and these answers are more accurate (16.4% vs. 12.8-13.5%).</w:t>
       </w:r>
     </w:p>
     <w:p>
@@ -1112,10 +1438,10 @@
         <w:rPr>
           <w:b/>
         </w:rPr>
-        <w:t xml:space="preserve">Why the principal range wins. </w:t>
+        <w:t xml:space="preserve">Why the top 16 is the best. </w:t>
       </w:r>
       <w:r>
-        <w:t>With PiSSA the adapter is initialized as A = U_r√S_r, B = √S_r V_rᵀ, so the trainable part is exactly the selected slice of the weight and fine-tuning changes the model only inside that subspace. The top singular directions carry the most energy (Q4: the top 16 hold 15-35% of a q_proj's energy, a 16-wide band at the 25% or 50% position only ~0.1-0.7%) and correspond to the input/output directions the layer actually uses, so updating them changes the layer's behaviour most efficiently. The adapter factors are also larger, which makes their gradients (∂L/∂A ∝ B, ∂L/∂B ∝ A) larger and learning faster. Middle and bottom directions are small, nearly unused by the pretrained model, so a rank-16 update there is a weaker lever.</w:t>
+        <w:t>In PiSSA, the adapter starts as A = U_r√S_r and B = √S_r V_rᵀ. So the model can only change the part of the weight that we choose. The top singular values have most of the energy. From Q4, the top 16 have 15-35% of the energy of q_proj, but 16 values at the 25% or 50% position have only about 0.1-0.7%. These top directions are the ones the layer really uses, so changing them has the biggest effect. Also, A and B are bigger at the start, so their gradients are bigger (∂L/∂A ∝ B, ∂L/∂B ∝ A), and the model learns faster. The middle and bottom directions are very small and the original model almost does not use them, so changing them helps less.</w:t>
       </w:r>
     </w:p>
     <w:p>
@@ -1127,14 +1453,15 @@
         <w:rPr>
           <w:b/>
         </w:rPr>
-        <w:t xml:space="preserve">Why the other ranges still learn. </w:t>
+        <w:t xml:space="preserve">Why the other ranges still work. </w:t>
       </w:r>
       <w:r>
-        <w:t>Even the bottom range (σ ≈ 0) improves far beyond the original model (3.4% → 11.5% GSM8K). AdamW normalizes each update by the gradient's running magnitude, so tiny factors still move by about the learning rate per step, and any 16-dimensional subspace is enough to learn the MetaMathQA answer format and some reasoning patterns. The principal subspace adds a further +3-4 points on GSM8K by also adapting the directions that matter most, consistent with the PiSSA paper's claim that tuning principal components converges faster and generalizes better than tuning the minor ones.</w:t>
+        <w:t>Even the bottom 16 (singular values close to 0) is much better than the original model (3.4% → 11.5% on GSM8K). One reason is AdamW: it scales each update by the gradient size, so even very small A and B still move about one learning rate per step. Also, 16 dimensions are enough to learn the answer format and some simple reasoning. Using the top 16 gives about 3-4 more points on GSM8K. This matches the PiSSA paper, which says that training the principal parts learns faster and works better than training the small parts.</w:t>
       </w:r>
     </w:p>
     <w:p>
       <w:pPr>
+        <w:keepNext/>
         <w:spacing w:before="120" w:after="40"/>
         <w:pBdr>
           <w:bottom w:val="single" w:sz="4" w:space="1" w:color="1F3A68"/>
@@ -1259,7 +1586,7 @@
                 <w:b/>
                 <w:sz w:val="18"/>
               </w:rPr>
-              <w:t>Minimum Target Rank (≥ 50% energy)</w:t>
+              <w:t>Minimum Target Rank for query projection weights (≥ 50% energy)</w:t>
             </w:r>
           </w:p>
         </w:tc>
@@ -1771,7 +2098,7 @@
           <w:i/>
           <w:sz w:val="17"/>
         </w:rPr>
-        <w:t>Left: singular value magnitudes (bar charts). Right: cumulative energy (line charts). First 200 of 2,048 singular values; energy = Σσᵢ² / Σσ², dashed line = 50%.</w:t>
+        <w:t>Left: singular value magnitude (bar chart). Right: cumulative energy (line chart). Only the first 200 of 2,048 singular values are shown. Energy = Σσᵢ² / Σσ². The dashed line is 50%.</w:t>
       </w:r>
     </w:p>
     <w:p>
@@ -1786,7 +2113,7 @@
         <w:t xml:space="preserve">Shape. </w:t>
       </w:r>
       <w:r>
-        <w:t>Every q_proj spectrum has a sharp head and a long, slowly decaying tail: a few large singular values (σ1 is 2-5× σ16) followed by an almost flat plateau. Reaching 50% energy needs only 62-120 of 2,048 directions (3-6% of full rank), but even the first 200 directions hold just 64-71% of the energy, so the weights are not truly low-rank; the remaining energy is spread thinly over hundreds of directions.</w:t>
+        <w:t>All three layers have a similar shape. There are a few large singular values at the beginning (σ1 is about 2.5-5.5 times σ16), and then a long and almost flat tail. To keep 50% of the energy, we only need 62-120 of the 2,048 values (3-6% of the full rank). But even the first 200 values only keep 63-71% of the energy. So the weight is not really low-rank. The rest of the energy is spread over many small values.</w:t>
       </w:r>
     </w:p>
     <w:p>
@@ -1798,10 +2125,10 @@
         <w:rPr>
           <w:b/>
         </w:rPr>
-        <w:t xml:space="preserve">Layer differences. </w:t>
+        <w:t xml:space="preserve">Differences between layers. </w:t>
       </w:r>
       <w:r>
-        <w:t>Layer 0 is the most concentrated (σ1 = 31.4 alone dominates; the top 16 hold 34.8% of the energy), layer 7 is the flattest (15.4% in the top 16, rank 120 needed) and layer 15 lies in between (rank 84). The first layer works directly on token embeddings, where a few dominant directions (e.g. common-token and position-related features) carry most of the signal; middle layers mix many distributed features, so their queries use more directions; the last layers specialize again toward next-token prediction.</w:t>
+        <w:t>Layer 0 is the most concentrated. σ1 = 31.4 is much bigger than the others, and the top 16 have 34.8% of the energy. Layer 7 is the most spread out (only 15.4% in the top 16, and it needs rank 120). Layer 15 is in the middle (rank 84). My guess is that layer 0 works directly on the token embeddings, so a few main directions carry most of the information. Middle layers mix many different features, so they use more directions. The last layers focus more again on predicting the next token.</w:t>
       </w:r>
     </w:p>
     <w:p>
@@ -1813,10 +2140,10 @@
         <w:rPr>
           <w:b/>
         </w:rPr>
-        <w:t xml:space="preserve">Implication. </w:t>
+        <w:t xml:space="preserve">What this means. </w:t>
       </w:r>
       <w:r>
-        <w:t>A fixed adapter rank therefore captures a very different share of each layer: rank 16 covers about 35% of layer 0's energy but only 15% of layer 7's. This supports PiSSA's idea of adapting the principal subspace, and suggests that layer-wise (adaptive) rank allocation would use a parameter budget more evenly.</w:t>
+        <w:t>If we use the same rank for every layer, each layer keeps a very different amount of energy. For example, rank 16 keeps about 35% of the energy in layer 0, but only 15% in layer 7. This supports the idea of PiSSA (training the principal part). It also suggests that giving different ranks to different layers may use the parameters better.</w:t>
       </w:r>
     </w:p>
     <w:sectPr>

</xml_diff>